<commit_message>
fix: teste do dono de 02/10 - numero da casa, troco, espelho curto
- "Qual número da casa? 🛵" (texto do dono), travado no codigo quando so
  falta o numero
- troco: endereco ("rua bejamin 2253", "Nº 2253") nao vira mais troco; o
  troco sai da resposta enquanto falta outro dado da entrega
- espelho curto no formato do dono (Cliente:, 📍 Retirada/Entrega numa linha,
  sem subtotal, "💳 Pgt:", "Posso confirmar pra hoje (sex, 02/10) às 20h?");
  espelho longo do modelo e trocado pelo do codigo; modelos do BLOCO 5
  atualizados no prompt
- varias perguntas sem nenhuma cobrir a etapa travada: sai a pergunta do
  codigo com todos os sabores pendentes (chat 26/09, caso 2)

Co-Authored-By: Claude Opus 5.5 <noreply@anthropic.com>
</commit_message>
<xml_diff>
--- a/PROMPTS ATUALIZADO PARA ENVIAR EDUARDO 18.09.26.docx
+++ b/PROMPTS ATUALIZADO PARA ENVIAR EDUARDO 18.09.26.docx
@@ -3118,138 +3118,69 @@
       </w:pPr>
       <w:r>
         <w:rPr>
-          <w:rFonts w:ascii="Segoe UI Emoji" w:hAnsi="Segoe UI Emoji" w:cs="Segoe UI Emoji"/>
-          <w:i/>
-          <w:sz w:val="44"/>
-          <w:szCs w:val="44"/>
-          <w:u w:val="single"/>
-        </w:rPr>
-        <w:t>📋</w:t>
-      </w:r>
-      <w:r>
-        <w:rPr>
-          <w:i/>
-          <w:sz w:val="44"/>
-          <w:szCs w:val="44"/>
-          <w:u w:val="single"/>
-        </w:rPr>
-        <w:t xml:space="preserve"> Resumo do Pedido:</w:t>
-      </w:r>
-    </w:p>
-    <w:p>
-      <w:pPr>
-        <w:rPr>
-          <w:i/>
-          <w:sz w:val="44"/>
-          <w:szCs w:val="44"/>
-          <w:u w:val="single"/>
-        </w:rPr>
-      </w:pPr>
-      <w:r>
-        <w:rPr>
-          <w:rFonts w:ascii="Segoe UI Emoji" w:hAnsi="Segoe UI Emoji" w:cs="Segoe UI Emoji"/>
-          <w:i/>
-          <w:sz w:val="44"/>
-          <w:szCs w:val="44"/>
-          <w:u w:val="single"/>
-        </w:rPr>
-        <w:t>👤</w:t>
-      </w:r>
-      <w:r>
-        <w:rPr>
-          <w:i/>
-          <w:sz w:val="44"/>
-          <w:szCs w:val="44"/>
-          <w:u w:val="single"/>
-        </w:rPr>
-        <w:t xml:space="preserve"> Cliente: [Nome]</w:t>
-      </w:r>
-    </w:p>
-    <w:p>
-      <w:pPr>
-        <w:rPr>
-          <w:i/>
-          <w:sz w:val="44"/>
-          <w:szCs w:val="44"/>
-          <w:u w:val="single"/>
-        </w:rPr>
-      </w:pPr>
-      <w:r>
-        <w:rPr>
-          <w:rFonts w:ascii="Segoe UI Emoji" w:hAnsi="Segoe UI Emoji" w:cs="Segoe UI Emoji"/>
-          <w:i/>
-          <w:sz w:val="44"/>
-          <w:szCs w:val="44"/>
-          <w:u w:val="single"/>
-        </w:rPr>
-        <w:t>📅</w:t>
-      </w:r>
-      <w:r>
-        <w:rPr>
-          <w:i/>
-          <w:sz w:val="44"/>
-          <w:szCs w:val="44"/>
-          <w:u w:val="single"/>
-        </w:rPr>
-        <w:t xml:space="preserve"> Data: [DD/MM/AAAA]</w:t>
-      </w:r>
-    </w:p>
-    <w:p>
-      <w:pPr>
-        <w:rPr>
-          <w:i/>
-          <w:sz w:val="44"/>
-          <w:szCs w:val="44"/>
-          <w:u w:val="single"/>
-        </w:rPr>
-      </w:pPr>
-      <w:r>
-        <w:rPr>
-          <w:rFonts w:ascii="Segoe UI Emoji" w:hAnsi="Segoe UI Emoji" w:cs="Segoe UI Emoji"/>
-          <w:i/>
-          <w:sz w:val="44"/>
-          <w:szCs w:val="44"/>
-          <w:u w:val="single"/>
-        </w:rPr>
-        <w:t>⏰</w:t>
-      </w:r>
-      <w:r>
-        <w:rPr>
-          <w:i/>
-          <w:sz w:val="44"/>
-          <w:szCs w:val="44"/>
-          <w:u w:val="single"/>
-        </w:rPr>
-        <w:t xml:space="preserve"> Horário: [Horário solicitado ou "Imediato"]</w:t>
-      </w:r>
-    </w:p>
-    <w:p>
-      <w:pPr>
-        <w:rPr>
-          <w:i/>
-          <w:sz w:val="44"/>
-          <w:szCs w:val="44"/>
-          <w:u w:val="single"/>
-        </w:rPr>
-      </w:pPr>
-      <w:r>
-        <w:rPr>
-          <w:rFonts w:ascii="Segoe UI Emoji" w:hAnsi="Segoe UI Emoji" w:cs="Segoe UI Emoji"/>
-          <w:i/>
-          <w:sz w:val="44"/>
-          <w:szCs w:val="44"/>
-          <w:u w:val="single"/>
-        </w:rPr>
-        <w:t>📍</w:t>
-      </w:r>
-      <w:r>
-        <w:rPr>
-          <w:i/>
-          <w:sz w:val="44"/>
-          <w:szCs w:val="44"/>
-          <w:u w:val="single"/>
-        </w:rPr>
-        <w:t xml:space="preserve"> Retirada: No balcão da loja (Av. Calama, 5892 - Igarapé)</w:t>
+          <w:i/>
+          <w:sz w:val="44"/>
+          <w:szCs w:val="44"/>
+          <w:u w:val="single"/>
+        </w:rPr>
+        <w:t>Cliente: [Nome]</w:t>
+      </w:r>
+    </w:p>
+    <w:p>
+      <w:pPr>
+        <w:rPr>
+          <w:i/>
+          <w:sz w:val="44"/>
+          <w:szCs w:val="44"/>
+          <w:u w:val="single"/>
+        </w:rPr>
+      </w:pPr>
+      <w:r>
+        <w:rPr>
+          <w:i/>
+          <w:sz w:val="44"/>
+          <w:szCs w:val="44"/>
+          <w:u w:val="single"/>
+        </w:rPr>
+        <w:t>📅 Data: [DD/MM/AAAA]</w:t>
+      </w:r>
+    </w:p>
+    <w:p>
+      <w:pPr>
+        <w:rPr>
+          <w:i/>
+          <w:sz w:val="44"/>
+          <w:szCs w:val="44"/>
+          <w:u w:val="single"/>
+        </w:rPr>
+      </w:pPr>
+      <w:r>
+        <w:rPr>
+          <w:i/>
+          <w:sz w:val="44"/>
+          <w:szCs w:val="44"/>
+          <w:u w:val="single"/>
+        </w:rPr>
+        <w:t>⏰ Horário: [Horário solicitado ou "Imediato"]</w:t>
+      </w:r>
+    </w:p>
+    <w:p>
+      <w:pPr>
+        <w:rPr>
+          <w:i/>
+          <w:sz w:val="44"/>
+          <w:szCs w:val="44"/>
+          <w:u w:val="single"/>
+        </w:rPr>
+      </w:pPr>
+      <w:r>
+        <w:rPr>
+          <w:i/>
+          <w:sz w:val="44"/>
+          <w:szCs w:val="44"/>
+          <w:u w:val="single"/>
+        </w:rPr>
+        <w:t>📍 Retirada: (Av. Calama, 5892 - Igarapé)</w:t>
       </w:r>
     </w:p>
     <w:p>
@@ -3287,135 +3218,65 @@
           <w:szCs w:val="44"/>
           <w:u w:val="single"/>
         </w:rPr>
-        <w:t xml:space="preserve">• [Quantidade] </w:t>
-      </w:r>
-      <w:proofErr w:type="spellStart"/>
-      <w:r>
-        <w:rPr>
-          <w:i/>
-          <w:sz w:val="44"/>
-          <w:szCs w:val="44"/>
-          <w:u w:val="single"/>
-        </w:rPr>
-        <w:t>un</w:t>
-      </w:r>
-      <w:proofErr w:type="spellEnd"/>
-      <w:r>
-        <w:rPr>
-          <w:i/>
-          <w:sz w:val="44"/>
-          <w:szCs w:val="44"/>
-          <w:u w:val="single"/>
-        </w:rPr>
-        <w:t xml:space="preserve"> - [Sabor/Item - Frito ou Assado]</w:t>
-      </w:r>
-    </w:p>
-    <w:p>
-      <w:pPr>
-        <w:rPr>
-          <w:i/>
-          <w:sz w:val="44"/>
-          <w:szCs w:val="44"/>
-          <w:u w:val="single"/>
-        </w:rPr>
-      </w:pPr>
-      <w:r>
-        <w:rPr>
-          <w:rFonts w:ascii="Segoe UI Emoji" w:hAnsi="Segoe UI Emoji" w:cs="Segoe UI Emoji"/>
-          <w:i/>
-          <w:sz w:val="44"/>
-          <w:szCs w:val="44"/>
-          <w:u w:val="single"/>
-        </w:rPr>
-        <w:t>💰</w:t>
-      </w:r>
-      <w:r>
-        <w:rPr>
-          <w:i/>
-          <w:sz w:val="44"/>
-          <w:szCs w:val="44"/>
-          <w:u w:val="single"/>
-        </w:rPr>
-        <w:t xml:space="preserve"> Total: R$ [Valor]</w:t>
-      </w:r>
-    </w:p>
-    <w:p>
-      <w:pPr>
-        <w:rPr>
-          <w:i/>
-          <w:sz w:val="44"/>
-          <w:szCs w:val="44"/>
-          <w:u w:val="single"/>
-        </w:rPr>
-      </w:pPr>
-      <w:r>
-        <w:rPr>
-          <w:rFonts w:ascii="Segoe UI Emoji" w:hAnsi="Segoe UI Emoji" w:cs="Segoe UI Emoji"/>
-          <w:i/>
-          <w:sz w:val="44"/>
-          <w:szCs w:val="44"/>
-          <w:u w:val="single"/>
-        </w:rPr>
-        <w:t>💳</w:t>
-      </w:r>
-      <w:r>
-        <w:rPr>
-          <w:i/>
-          <w:sz w:val="44"/>
-          <w:szCs w:val="44"/>
-          <w:u w:val="single"/>
-        </w:rPr>
-        <w:t xml:space="preserve"> Pagamento: No balcão da loja</w:t>
-      </w:r>
-    </w:p>
-    <w:p>
-      <w:pPr>
-        <w:rPr>
-          <w:i/>
-          <w:sz w:val="44"/>
-          <w:szCs w:val="44"/>
-          <w:u w:val="single"/>
-        </w:rPr>
-      </w:pPr>
-    </w:p>
-    <w:p>
-      <w:pPr>
-        <w:rPr>
-          <w:i/>
-          <w:sz w:val="44"/>
-          <w:szCs w:val="44"/>
-          <w:u w:val="single"/>
-        </w:rPr>
-      </w:pPr>
-      <w:r>
-        <w:rPr>
-          <w:i/>
-          <w:sz w:val="44"/>
-          <w:szCs w:val="44"/>
-          <w:u w:val="single"/>
-        </w:rPr>
-        <w:t xml:space="preserve">Posso confirmar o seu pedido? </w:t>
-      </w:r>
-      <w:r>
-        <w:rPr>
-          <w:rFonts w:ascii="Segoe UI Emoji" w:hAnsi="Segoe UI Emoji" w:cs="Segoe UI Emoji"/>
-          <w:i/>
-          <w:sz w:val="44"/>
-          <w:szCs w:val="44"/>
-          <w:u w:val="single"/>
-        </w:rPr>
-        <w:t>💛</w:t>
-      </w:r>
-    </w:p>
-    <w:p>
-      <w:pPr>
-        <w:rPr>
-          <w:i/>
-          <w:sz w:val="44"/>
-          <w:szCs w:val="44"/>
-          <w:u w:val="single"/>
-        </w:rPr>
-      </w:pPr>
+        <w:t>• [Quantidade] un - [Sabor/Item] — R$ [Valor]</w:t>
+      </w:r>
+    </w:p>
+    <w:p>
+      <w:pPr>
+        <w:rPr>
+          <w:i/>
+          <w:sz w:val="44"/>
+          <w:szCs w:val="44"/>
+          <w:u w:val="single"/>
+        </w:rPr>
+      </w:pPr>
+      <w:r>
+        <w:rPr>
+          <w:i/>
+          <w:sz w:val="44"/>
+          <w:szCs w:val="44"/>
+          <w:u w:val="single"/>
+        </w:rPr>
+        <w:t>💰 Total: R$ [Valor]</w:t>
+      </w:r>
+    </w:p>
+    <w:p>
+      <w:pPr>
+        <w:rPr>
+          <w:i/>
+          <w:sz w:val="44"/>
+          <w:szCs w:val="44"/>
+          <w:u w:val="single"/>
+        </w:rPr>
+      </w:pPr>
+      <w:r>
+        <w:rPr>
+          <w:i/>
+          <w:sz w:val="44"/>
+          <w:szCs w:val="44"/>
+          <w:u w:val="single"/>
+        </w:rPr>
+        <w:t>💳 Pgt: Balcão</w:t>
+      </w:r>
+    </w:p>
+    <w:p>
+      <w:pPr>
+        <w:rPr>
+          <w:i/>
+          <w:sz w:val="44"/>
+          <w:szCs w:val="44"/>
+          <w:u w:val="single"/>
+        </w:rPr>
+      </w:pPr>
+      <w:r>
+        <w:rPr>
+          <w:i/>
+          <w:sz w:val="44"/>
+          <w:szCs w:val="44"/>
+          <w:u w:val="single"/>
+        </w:rPr>
+        <w:t>Posso confirmar pra hoje (sex, DD/MM) às [Horário]? 💛</w:t>
+      </w:r>
     </w:p>
     <w:p>
       <w:pPr>
@@ -3447,167 +3308,69 @@
       </w:pPr>
       <w:r>
         <w:rPr>
-          <w:rFonts w:ascii="Segoe UI Emoji" w:hAnsi="Segoe UI Emoji" w:cs="Segoe UI Emoji"/>
-          <w:i/>
-          <w:sz w:val="44"/>
-          <w:szCs w:val="44"/>
-          <w:u w:val="single"/>
-        </w:rPr>
-        <w:t>📋</w:t>
-      </w:r>
-      <w:r>
-        <w:rPr>
-          <w:i/>
-          <w:sz w:val="44"/>
-          <w:szCs w:val="44"/>
-          <w:u w:val="single"/>
-        </w:rPr>
-        <w:t xml:space="preserve"> Resumo do Pedido:</w:t>
-      </w:r>
-    </w:p>
-    <w:p>
-      <w:pPr>
-        <w:rPr>
-          <w:i/>
-          <w:sz w:val="44"/>
-          <w:szCs w:val="44"/>
-          <w:u w:val="single"/>
-        </w:rPr>
-      </w:pPr>
-      <w:r>
-        <w:rPr>
-          <w:rFonts w:ascii="Segoe UI Emoji" w:hAnsi="Segoe UI Emoji" w:cs="Segoe UI Emoji"/>
-          <w:i/>
-          <w:sz w:val="44"/>
-          <w:szCs w:val="44"/>
-          <w:u w:val="single"/>
-        </w:rPr>
-        <w:t>👤</w:t>
-      </w:r>
-      <w:r>
-        <w:rPr>
-          <w:i/>
-          <w:sz w:val="44"/>
-          <w:szCs w:val="44"/>
-          <w:u w:val="single"/>
-        </w:rPr>
-        <w:t xml:space="preserve"> Cliente: [Nome]</w:t>
-      </w:r>
-    </w:p>
-    <w:p>
-      <w:pPr>
-        <w:rPr>
-          <w:i/>
-          <w:sz w:val="44"/>
-          <w:szCs w:val="44"/>
-          <w:u w:val="single"/>
-        </w:rPr>
-      </w:pPr>
-      <w:r>
-        <w:rPr>
-          <w:rFonts w:ascii="Segoe UI Emoji" w:hAnsi="Segoe UI Emoji" w:cs="Segoe UI Emoji"/>
-          <w:i/>
-          <w:sz w:val="44"/>
-          <w:szCs w:val="44"/>
-          <w:u w:val="single"/>
-        </w:rPr>
-        <w:t>📅</w:t>
-      </w:r>
-      <w:r>
-        <w:rPr>
-          <w:i/>
-          <w:sz w:val="44"/>
-          <w:szCs w:val="44"/>
-          <w:u w:val="single"/>
-        </w:rPr>
-        <w:t xml:space="preserve"> Data: [DD/MM/AAAA]</w:t>
-      </w:r>
-    </w:p>
-    <w:p>
-      <w:pPr>
-        <w:rPr>
-          <w:i/>
-          <w:sz w:val="44"/>
-          <w:szCs w:val="44"/>
-          <w:u w:val="single"/>
-        </w:rPr>
-      </w:pPr>
-      <w:r>
-        <w:rPr>
-          <w:rFonts w:ascii="Segoe UI Emoji" w:hAnsi="Segoe UI Emoji" w:cs="Segoe UI Emoji"/>
-          <w:i/>
-          <w:sz w:val="44"/>
-          <w:szCs w:val="44"/>
-          <w:u w:val="single"/>
-        </w:rPr>
-        <w:t>⏰</w:t>
-      </w:r>
-      <w:r>
-        <w:rPr>
-          <w:i/>
-          <w:sz w:val="44"/>
-          <w:szCs w:val="44"/>
-          <w:u w:val="single"/>
-        </w:rPr>
-        <w:t xml:space="preserve"> Horário: [Horário solicitado ou "Imediato"]</w:t>
-      </w:r>
-    </w:p>
-    <w:p>
-      <w:pPr>
-        <w:rPr>
-          <w:i/>
-          <w:sz w:val="44"/>
-          <w:szCs w:val="44"/>
-          <w:u w:val="single"/>
-        </w:rPr>
-      </w:pPr>
-      <w:r>
-        <w:rPr>
-          <w:rFonts w:ascii="Segoe UI Emoji" w:hAnsi="Segoe UI Emoji" w:cs="Segoe UI Emoji"/>
-          <w:i/>
-          <w:sz w:val="44"/>
-          <w:szCs w:val="44"/>
-          <w:u w:val="single"/>
-        </w:rPr>
-        <w:t>📍</w:t>
-      </w:r>
-      <w:r>
-        <w:rPr>
-          <w:i/>
-          <w:sz w:val="44"/>
-          <w:szCs w:val="44"/>
-          <w:u w:val="single"/>
-        </w:rPr>
-        <w:t xml:space="preserve"> Bairro: [Nome do Bairro]</w:t>
-      </w:r>
-    </w:p>
-    <w:p>
-      <w:pPr>
-        <w:rPr>
-          <w:i/>
-          <w:sz w:val="44"/>
-          <w:szCs w:val="44"/>
-          <w:u w:val="single"/>
-        </w:rPr>
-      </w:pPr>
-      <w:r>
-        <w:rPr>
-          <w:rFonts w:ascii="Segoe UI Emoji" w:hAnsi="Segoe UI Emoji" w:cs="Segoe UI Emoji"/>
-          <w:i/>
-          <w:sz w:val="44"/>
-          <w:szCs w:val="44"/>
-          <w:u w:val="single"/>
-        </w:rPr>
-        <w:t>📍</w:t>
-      </w:r>
-      <w:r>
-        <w:rPr>
-          <w:i/>
-          <w:sz w:val="44"/>
-          <w:szCs w:val="44"/>
-          <w:u w:val="single"/>
-        </w:rPr>
-        <w:t xml:space="preserve"> Endereço: [Rua, Número e Ponto de Referência]</w:t>
+          <w:i/>
+          <w:sz w:val="44"/>
+          <w:szCs w:val="44"/>
+          <w:u w:val="single"/>
+        </w:rPr>
+        <w:t>Cliente: [Nome]</w:t>
+      </w:r>
+    </w:p>
+    <w:p>
+      <w:pPr>
+        <w:rPr>
+          <w:i/>
+          <w:sz w:val="44"/>
+          <w:szCs w:val="44"/>
+          <w:u w:val="single"/>
+        </w:rPr>
+      </w:pPr>
+      <w:r>
+        <w:rPr>
+          <w:i/>
+          <w:sz w:val="44"/>
+          <w:szCs w:val="44"/>
+          <w:u w:val="single"/>
+        </w:rPr>
+        <w:t>📅 Data: [DD/MM/AAAA]</w:t>
+      </w:r>
+    </w:p>
+    <w:p>
+      <w:pPr>
+        <w:rPr>
+          <w:i/>
+          <w:sz w:val="44"/>
+          <w:szCs w:val="44"/>
+          <w:u w:val="single"/>
+        </w:rPr>
+      </w:pPr>
+      <w:r>
+        <w:rPr>
+          <w:i/>
+          <w:sz w:val="44"/>
+          <w:szCs w:val="44"/>
+          <w:u w:val="single"/>
+        </w:rPr>
+        <w:t>⏰ Horário: [Horário solicitado ou "Imediato"]</w:t>
+      </w:r>
+    </w:p>
+    <w:p>
+      <w:pPr>
+        <w:rPr>
+          <w:i/>
+          <w:sz w:val="44"/>
+          <w:szCs w:val="44"/>
+          <w:u w:val="single"/>
+        </w:rPr>
+      </w:pPr>
+      <w:r>
+        <w:rPr>
+          <w:i/>
+          <w:sz w:val="44"/>
+          <w:szCs w:val="44"/>
+          <w:u w:val="single"/>
+        </w:rPr>
+        <w:t>📍 Entrega: [Rua e Número] - [Bairro]</w:t>
       </w:r>
     </w:p>
     <w:p>
@@ -3645,105 +3408,26 @@
           <w:szCs w:val="44"/>
           <w:u w:val="single"/>
         </w:rPr>
-        <w:t xml:space="preserve">• [Quantidade] </w:t>
-      </w:r>
-      <w:proofErr w:type="spellStart"/>
-      <w:r>
-        <w:rPr>
-          <w:i/>
-          <w:sz w:val="44"/>
-          <w:szCs w:val="44"/>
-          <w:u w:val="single"/>
-        </w:rPr>
-        <w:t>un</w:t>
-      </w:r>
-      <w:proofErr w:type="spellEnd"/>
-      <w:r>
-        <w:rPr>
-          <w:i/>
-          <w:sz w:val="44"/>
-          <w:szCs w:val="44"/>
-          <w:u w:val="single"/>
-        </w:rPr>
-        <w:t xml:space="preserve"> - [Sabor/Item - Frito ou Assado]</w:t>
-      </w:r>
-    </w:p>
-    <w:p>
-      <w:pPr>
-        <w:rPr>
-          <w:i/>
-          <w:sz w:val="44"/>
-          <w:szCs w:val="44"/>
-          <w:u w:val="single"/>
-        </w:rPr>
-      </w:pPr>
-      <w:r>
-        <w:rPr>
-          <w:rFonts w:ascii="Segoe UI Emoji" w:hAnsi="Segoe UI Emoji" w:cs="Segoe UI Emoji"/>
-          <w:i/>
-          <w:sz w:val="44"/>
-          <w:szCs w:val="44"/>
-          <w:u w:val="single"/>
-        </w:rPr>
-        <w:t>💰</w:t>
-      </w:r>
-      <w:r>
-        <w:rPr>
-          <w:i/>
-          <w:sz w:val="44"/>
-          <w:szCs w:val="44"/>
-          <w:u w:val="single"/>
-        </w:rPr>
-        <w:t xml:space="preserve"> Subtotal: R$ [Valor]</w:t>
-      </w:r>
-    </w:p>
-    <w:p>
-      <w:pPr>
-        <w:rPr>
-          <w:i/>
-          <w:sz w:val="44"/>
-          <w:szCs w:val="44"/>
-          <w:u w:val="single"/>
-        </w:rPr>
-      </w:pPr>
-      <w:r>
-        <w:rPr>
-          <w:rFonts w:ascii="Segoe UI Emoji" w:hAnsi="Segoe UI Emoji" w:cs="Segoe UI Emoji"/>
-          <w:i/>
-          <w:sz w:val="44"/>
-          <w:szCs w:val="44"/>
-          <w:u w:val="single"/>
-        </w:rPr>
-        <w:t>🚚</w:t>
-      </w:r>
-      <w:r>
-        <w:rPr>
-          <w:i/>
-          <w:sz w:val="44"/>
-          <w:szCs w:val="44"/>
-          <w:u w:val="single"/>
-        </w:rPr>
-        <w:t xml:space="preserve"> Frete: R$ [Valor oficial da </w:t>
-      </w:r>
-      <w:proofErr w:type="spellStart"/>
-      <w:r>
-        <w:rPr>
-          <w:i/>
-          <w:sz w:val="44"/>
-          <w:szCs w:val="44"/>
-          <w:u w:val="single"/>
-        </w:rPr>
-        <w:t>DeliveryFee</w:t>
-      </w:r>
-      <w:proofErr w:type="spellEnd"/>
-      <w:r>
-        <w:rPr>
-          <w:i/>
-          <w:sz w:val="44"/>
-          <w:szCs w:val="44"/>
-          <w:u w:val="single"/>
-        </w:rPr>
-        <w:t>]</w:t>
+        <w:t>• [Quantidade] un - [Sabor/Item] — R$ [Valor]</w:t>
+      </w:r>
+    </w:p>
+    <w:p>
+      <w:pPr>
+        <w:rPr>
+          <w:i/>
+          <w:sz w:val="44"/>
+          <w:szCs w:val="44"/>
+          <w:u w:val="single"/>
+        </w:rPr>
+      </w:pPr>
+      <w:r>
+        <w:rPr>
+          <w:i/>
+          <w:sz w:val="44"/>
+          <w:szCs w:val="44"/>
+          <w:u w:val="single"/>
+        </w:rPr>
+        <w:t>🚚 Frete: R$ [Valor oficial da DeliveryFee]</w:t>
       </w:r>
     </w:p>
     <w:p>
@@ -3764,23 +3448,6 @@
         </w:rPr>
         <w:t>[Se Cartão: 🛵 Taxa de retorno: R$ 2,00]</w:t>
       </w:r>
-      <w:r>
-        <w:rPr>
-          <w:rFonts w:ascii="Segoe UI Emoji" w:hAnsi="Segoe UI Emoji" w:cs="Segoe UI Emoji"/>
-          <w:i/>
-          <w:sz w:val="44"/>
-          <w:szCs w:val="44"/>
-          <w:u w:val="single"/>
-        </w:rPr>
-      </w:r>
-      <w:r>
-        <w:rPr>
-          <w:i/>
-          <w:sz w:val="44"/>
-          <w:szCs w:val="44"/>
-          <w:u w:val="single"/>
-        </w:rPr>
-      </w:r>
     </w:p>
     <w:p>
       <w:pPr>
@@ -3812,89 +3479,50 @@
       </w:pPr>
       <w:r>
         <w:rPr>
-          <w:rFonts w:ascii="Segoe UI Emoji" w:hAnsi="Segoe UI Emoji" w:cs="Segoe UI Emoji"/>
-          <w:i/>
-          <w:sz w:val="44"/>
-          <w:szCs w:val="44"/>
-          <w:u w:val="single"/>
-        </w:rPr>
-        <w:t>💵</w:t>
-      </w:r>
-      <w:r>
-        <w:rPr>
-          <w:i/>
-          <w:sz w:val="44"/>
-          <w:szCs w:val="44"/>
-          <w:u w:val="single"/>
-        </w:rPr>
-        <w:t xml:space="preserve"> Total: R$ [Valor somado]</w:t>
-      </w:r>
-    </w:p>
-    <w:p>
-      <w:pPr>
-        <w:rPr>
-          <w:i/>
-          <w:sz w:val="44"/>
-          <w:szCs w:val="44"/>
-          <w:u w:val="single"/>
-        </w:rPr>
-      </w:pPr>
-      <w:r>
-        <w:rPr>
-          <w:rFonts w:ascii="Segoe UI Emoji" w:hAnsi="Segoe UI Emoji" w:cs="Segoe UI Emoji"/>
-          <w:i/>
-          <w:sz w:val="44"/>
-          <w:szCs w:val="44"/>
-          <w:u w:val="single"/>
-        </w:rPr>
-        <w:t>💳 Pagamento: [Pix | Cartão | Dinheiro (sem troco) | Dinheiro (troco para R$ X - levar R$ Y)]</w:t>
-      </w:r>
-      <w:r>
-        <w:rPr>
-          <w:i/>
-          <w:sz w:val="44"/>
-          <w:szCs w:val="44"/>
-          <w:u w:val="single"/>
-        </w:rPr>
-      </w:r>
-    </w:p>
-    <w:p>
-      <w:pPr>
-        <w:rPr>
-          <w:i/>
-          <w:sz w:val="44"/>
-          <w:szCs w:val="44"/>
-          <w:u w:val="single"/>
-        </w:rPr>
-      </w:pPr>
-    </w:p>
-    <w:p>
-      <w:pPr>
-        <w:rPr>
-          <w:i/>
-          <w:sz w:val="44"/>
-          <w:szCs w:val="44"/>
-          <w:u w:val="single"/>
-        </w:rPr>
-      </w:pPr>
-      <w:r>
-        <w:rPr>
-          <w:i/>
-          <w:sz w:val="44"/>
-          <w:szCs w:val="44"/>
-          <w:u w:val="single"/>
-        </w:rPr>
-        <w:t xml:space="preserve">Posso confirmar o seu pedido? </w:t>
-      </w:r>
-      <w:r>
-        <w:rPr>
-          <w:rFonts w:ascii="Segoe UI Emoji" w:hAnsi="Segoe UI Emoji" w:cs="Segoe UI Emoji"/>
-          <w:i/>
-          <w:sz w:val="44"/>
-          <w:szCs w:val="44"/>
-          <w:u w:val="single"/>
-        </w:rPr>
-        <w:t>💛</w:t>
+          <w:i/>
+          <w:sz w:val="44"/>
+          <w:szCs w:val="44"/>
+          <w:u w:val="single"/>
+        </w:rPr>
+        <w:t>💰 Total: R$ [Valor somado]</w:t>
+      </w:r>
+    </w:p>
+    <w:p>
+      <w:pPr>
+        <w:rPr>
+          <w:i/>
+          <w:sz w:val="44"/>
+          <w:szCs w:val="44"/>
+          <w:u w:val="single"/>
+        </w:rPr>
+      </w:pPr>
+      <w:r>
+        <w:rPr>
+          <w:i/>
+          <w:sz w:val="44"/>
+          <w:szCs w:val="44"/>
+          <w:u w:val="single"/>
+        </w:rPr>
+        <w:t>💳 Pgt: [Pix | Cartão | Dinheiro (sem troco) | Dinheiro (troco para R$ X - levar R$ Y)]</w:t>
+      </w:r>
+    </w:p>
+    <w:p>
+      <w:pPr>
+        <w:rPr>
+          <w:i/>
+          <w:sz w:val="44"/>
+          <w:szCs w:val="44"/>
+          <w:u w:val="single"/>
+        </w:rPr>
+      </w:pPr>
+      <w:r>
+        <w:rPr>
+          <w:i/>
+          <w:sz w:val="44"/>
+          <w:szCs w:val="44"/>
+          <w:u w:val="single"/>
+        </w:rPr>
+        <w:t>Posso confirmar pra hoje (sex, DD/MM) às [Horário]? 💛</w:t>
       </w:r>
     </w:p>
     <w:p>

</xml_diff>